<commit_message>
update format qatar 2
</commit_message>
<xml_diff>
--- a/public/templates/QatarEnergy LNG Medical Department.docx
+++ b/public/templates/QatarEnergy LNG Medical Department.docx
@@ -3329,6 +3329,7 @@
               <w:spacing w:line="195" w:lineRule="exact"/>
               <w:ind w:left="78"/>
               <w:rPr>
+                <w:spacing w:val="-2"/>
                 <w:sz w:val="16"/>
               </w:rPr>
             </w:pPr>
@@ -3366,6 +3367,39 @@
                 <w:sz w:val="16"/>
               </w:rPr>
               <w:t>specify)</w:t>
+            </w:r>
+          </w:p>
+          <w:p>
+            <w:pPr>
+              <w:pStyle w:val="TableParagraph"/>
+              <w:spacing w:line="195" w:lineRule="exact"/>
+              <w:ind w:left="78"/>
+              <w:rPr>
+                <w:sz w:val="16"/>
+              </w:rPr>
+            </w:pPr>
+            <w:r>
+              <w:rPr>
+                <w:spacing w:val="-2"/>
+                <w:sz w:val="16"/>
+              </w:rPr>
+              <w:t>{{</w:t>
+            </w:r>
+            <w:proofErr w:type="spellStart"/>
+            <w:r>
+              <w:rPr>
+                <w:spacing w:val="-2"/>
+                <w:sz w:val="16"/>
+              </w:rPr>
+              <w:t>others_ifyes</w:t>
+            </w:r>
+            <w:proofErr w:type="spellEnd"/>
+            <w:r>
+              <w:rPr>
+                <w:spacing w:val="-2"/>
+                <w:sz w:val="16"/>
+              </w:rPr>
+              <w:t>))</w:t>
             </w:r>
           </w:p>
         </w:tc>
@@ -14385,8 +14419,7 @@
               <w:spacing w:before="29"/>
               <w:ind w:left="112"/>
               <w:rPr>
-                <w:i/>
-                <w:sz w:val="14"/>
+                <w:sz w:val="16"/>
               </w:rPr>
             </w:pPr>
             <w:r>
@@ -14563,19 +14596,169 @@
             <w:r>
               <w:rPr>
                 <w:i/>
-                <w:spacing w:val="-2"/>
                 <w:sz w:val="12"/>
               </w:rPr>
-              <w:t>{</w:t>
+              <w:tab/>
             </w:r>
             <w:proofErr w:type="gramEnd"/>
             <w:r>
               <w:rPr>
                 <w:i/>
+                <w:sz w:val="14"/>
+              </w:rPr>
+              <w:t>How</w:t>
+            </w:r>
+            <w:r>
+              <w:rPr>
+                <w:i/>
+                <w:spacing w:val="-5"/>
+                <w:sz w:val="14"/>
+              </w:rPr>
+              <w:t xml:space="preserve"> </w:t>
+            </w:r>
+            <w:r>
+              <w:rPr>
+                <w:i/>
+                <w:sz w:val="14"/>
+              </w:rPr>
+              <w:t>Long</w:t>
+            </w:r>
+            <w:r>
+              <w:rPr>
+                <w:i/>
+                <w:spacing w:val="-3"/>
+                <w:sz w:val="14"/>
+              </w:rPr>
+              <w:t xml:space="preserve"> </w:t>
+            </w:r>
+            <w:r>
+              <w:rPr>
+                <w:i/>
+                <w:sz w:val="14"/>
+              </w:rPr>
+              <w:t>and</w:t>
+            </w:r>
+            <w:r>
+              <w:rPr>
+                <w:i/>
+                <w:spacing w:val="-5"/>
+                <w:sz w:val="14"/>
+              </w:rPr>
+              <w:t xml:space="preserve"> </w:t>
+            </w:r>
+            <w:r>
+              <w:rPr>
+                <w:i/>
+                <w:sz w:val="14"/>
+              </w:rPr>
+              <w:t>how</w:t>
+            </w:r>
+            <w:r>
+              <w:rPr>
+                <w:i/>
+                <w:spacing w:val="-4"/>
+                <w:sz w:val="14"/>
+              </w:rPr>
+              <w:t xml:space="preserve"> </w:t>
+            </w:r>
+            <w:r>
+              <w:rPr>
+                <w:i/>
+                <w:sz w:val="14"/>
+              </w:rPr>
+              <w:t>frequent</w:t>
+            </w:r>
+            <w:r>
+              <w:rPr>
+                <w:i/>
+                <w:spacing w:val="-8"/>
+                <w:sz w:val="14"/>
+              </w:rPr>
+              <w:t xml:space="preserve"> </w:t>
+            </w:r>
+            <w:r>
+              <w:rPr>
+                <w:i/>
+                <w:sz w:val="14"/>
+              </w:rPr>
+              <w:t>per</w:t>
+            </w:r>
+            <w:r>
+              <w:rPr>
+                <w:i/>
+                <w:spacing w:val="-8"/>
+                <w:sz w:val="14"/>
+              </w:rPr>
+              <w:t xml:space="preserve"> </w:t>
+            </w:r>
+            <w:r>
+              <w:rPr>
+                <w:i/>
+                <w:sz w:val="14"/>
+              </w:rPr>
+              <w:t>day</w:t>
+            </w:r>
+            <w:r>
+              <w:rPr>
+                <w:i/>
+                <w:spacing w:val="-7"/>
+                <w:sz w:val="14"/>
+              </w:rPr>
+              <w:t xml:space="preserve"> </w:t>
+            </w:r>
+            <w:r>
+              <w:rPr>
+                <w:i/>
+                <w:sz w:val="14"/>
+              </w:rPr>
+              <w:t>or</w:t>
+            </w:r>
+            <w:r>
+              <w:rPr>
+                <w:i/>
+                <w:spacing w:val="-5"/>
+                <w:sz w:val="14"/>
+              </w:rPr>
+              <w:t xml:space="preserve"> </w:t>
+            </w:r>
+            <w:r>
+              <w:rPr>
+                <w:i/>
+                <w:spacing w:val="-2"/>
+                <w:sz w:val="14"/>
+              </w:rPr>
+              <w:t>week?</w:t>
+            </w:r>
+            <w:r>
+              <w:rPr>
+                <w:i/>
+                <w:spacing w:val="-2"/>
+                <w:sz w:val="14"/>
+              </w:rPr>
+              <w:t xml:space="preserve"> </w:t>
+            </w:r>
+          </w:p>
+          <w:p>
+            <w:pPr>
+              <w:tabs>
+                <w:tab w:val="left" w:pos="1867"/>
+                <w:tab w:val="left" w:pos="6778"/>
+              </w:tabs>
+              <w:rPr>
+                <w:sz w:val="16"/>
+                <w:szCs w:val="16"/>
+              </w:rPr>
+            </w:pPr>
+            <w:r>
+              <w:tab/>
+            </w:r>
+            <w:r>
+              <w:rPr>
+                <w:i/>
                 <w:spacing w:val="-2"/>
                 <w:sz w:val="12"/>
               </w:rPr>
-              <w:t>{</w:t>
+              <w:t>{{</w:t>
             </w:r>
             <w:proofErr w:type="spellStart"/>
             <w:r>
@@ -14598,6 +14781,7 @@
             <w:r>
               <w:rPr>
                 <w:i/>
+                <w:spacing w:val="-2"/>
                 <w:sz w:val="12"/>
               </w:rPr>
               <w:tab/>
@@ -14605,130 +14789,36 @@
             <w:r>
               <w:rPr>
                 <w:i/>
-                <w:sz w:val="14"/>
-              </w:rPr>
-              <w:t>How</w:t>
-            </w:r>
-            <w:r>
-              <w:rPr>
-                <w:i/>
-                <w:spacing w:val="-5"/>
-                <w:sz w:val="14"/>
-              </w:rPr>
-              <w:t xml:space="preserve"> </w:t>
-            </w:r>
-            <w:r>
-              <w:rPr>
-                <w:i/>
-                <w:sz w:val="14"/>
-              </w:rPr>
-              <w:t>Long</w:t>
-            </w:r>
-            <w:r>
-              <w:rPr>
-                <w:i/>
-                <w:spacing w:val="-3"/>
-                <w:sz w:val="14"/>
-              </w:rPr>
-              <w:t xml:space="preserve"> </w:t>
-            </w:r>
-            <w:r>
-              <w:rPr>
-                <w:i/>
-                <w:sz w:val="14"/>
-              </w:rPr>
-              <w:t>and</w:t>
-            </w:r>
-            <w:r>
-              <w:rPr>
-                <w:i/>
-                <w:spacing w:val="-5"/>
-                <w:sz w:val="14"/>
-              </w:rPr>
-              <w:t xml:space="preserve"> </w:t>
-            </w:r>
-            <w:r>
-              <w:rPr>
-                <w:i/>
-                <w:sz w:val="14"/>
-              </w:rPr>
-              <w:t>how</w:t>
-            </w:r>
-            <w:r>
-              <w:rPr>
-                <w:i/>
-                <w:spacing w:val="-4"/>
-                <w:sz w:val="14"/>
-              </w:rPr>
-              <w:t xml:space="preserve"> </w:t>
-            </w:r>
-            <w:r>
-              <w:rPr>
-                <w:i/>
-                <w:sz w:val="14"/>
-              </w:rPr>
-              <w:t>frequent</w:t>
-            </w:r>
-            <w:r>
-              <w:rPr>
-                <w:i/>
-                <w:spacing w:val="-8"/>
-                <w:sz w:val="14"/>
-              </w:rPr>
-              <w:t xml:space="preserve"> </w:t>
-            </w:r>
-            <w:r>
-              <w:rPr>
-                <w:i/>
-                <w:sz w:val="14"/>
-              </w:rPr>
-              <w:t>per</w:t>
-            </w:r>
-            <w:r>
-              <w:rPr>
-                <w:i/>
-                <w:spacing w:val="-8"/>
-                <w:sz w:val="14"/>
-              </w:rPr>
-              <w:t xml:space="preserve"> </w:t>
-            </w:r>
-            <w:r>
-              <w:rPr>
-                <w:i/>
-                <w:sz w:val="14"/>
-              </w:rPr>
-              <w:t>day</w:t>
-            </w:r>
-            <w:r>
-              <w:rPr>
-                <w:i/>
-                <w:spacing w:val="-7"/>
-                <w:sz w:val="14"/>
-              </w:rPr>
-              <w:t xml:space="preserve"> </w:t>
-            </w:r>
-            <w:r>
-              <w:rPr>
-                <w:i/>
-                <w:sz w:val="14"/>
-              </w:rPr>
-              <w:t>or</w:t>
-            </w:r>
-            <w:r>
-              <w:rPr>
-                <w:i/>
-                <w:spacing w:val="-5"/>
-                <w:sz w:val="14"/>
-              </w:rPr>
-              <w:t xml:space="preserve"> </w:t>
-            </w:r>
-            <w:r>
-              <w:rPr>
-                <w:i/>
-                <w:spacing w:val="-2"/>
-                <w:sz w:val="14"/>
-              </w:rPr>
-              <w:t>week?</w:t>
+                <w:spacing w:val="-2"/>
+                <w:sz w:val="14"/>
+              </w:rPr>
+              <w:t>{{</w:t>
+            </w:r>
+            <w:proofErr w:type="spellStart"/>
+            <w:r>
+              <w:rPr>
+                <w:i/>
+                <w:spacing w:val="-2"/>
+                <w:sz w:val="14"/>
+              </w:rPr>
+              <w:t>h</w:t>
+            </w:r>
+            <w:r>
+              <w:rPr>
+                <w:i/>
+                <w:spacing w:val="-2"/>
+                <w:sz w:val="14"/>
+              </w:rPr>
+              <w:t>l_hf</w:t>
+            </w:r>
+            <w:proofErr w:type="spellEnd"/>
+            <w:r>
+              <w:rPr>
+                <w:i/>
+                <w:spacing w:val="-2"/>
+                <w:sz w:val="14"/>
+              </w:rPr>
+              <w:t>}}</w:t>
             </w:r>
           </w:p>
         </w:tc>
@@ -15124,6 +15214,38 @@
                 <w:sz w:val="16"/>
               </w:rPr>
               <w:t>week</w:t>
+            </w:r>
+          </w:p>
+          <w:p>
+            <w:pPr>
+              <w:ind w:left="113"/>
+              <w:rPr>
+                <w:sz w:val="16"/>
+                <w:szCs w:val="16"/>
+              </w:rPr>
+            </w:pPr>
+            <w:r>
+              <w:rPr>
+                <w:sz w:val="16"/>
+                <w:szCs w:val="16"/>
+              </w:rPr>
+              <w:t>{{</w:t>
+            </w:r>
+            <w:proofErr w:type="spellStart"/>
+            <w:r>
+              <w:rPr>
+                <w:sz w:val="16"/>
+                <w:szCs w:val="16"/>
+              </w:rPr>
+              <w:t>answer_ifyes</w:t>
+            </w:r>
+            <w:proofErr w:type="spellEnd"/>
+            <w:r>
+              <w:rPr>
+                <w:sz w:val="16"/>
+                <w:szCs w:val="16"/>
+              </w:rPr>
+              <w:t>}}</w:t>
             </w:r>
           </w:p>
         </w:tc>
@@ -28787,6 +28909,13 @@
                                       <w:szCs w:val="16"/>
                                     </w:rPr>
                                   </w:pPr>
+                                  <w:r>
+                                    <w:rPr>
+                                      <w:sz w:val="16"/>
+                                      <w:szCs w:val="16"/>
+                                    </w:rPr>
+                                    <w:t>{{date}}</w:t>
+                                  </w:r>
                                 </w:p>
                               </w:txbxContent>
                             </wps:txbx>
@@ -28814,6 +28943,13 @@
                                 <w:szCs w:val="16"/>
                               </w:rPr>
                             </w:pPr>
+                            <w:r>
+                              <w:rPr>
+                                <w:sz w:val="16"/>
+                                <w:szCs w:val="16"/>
+                              </w:rPr>
+                              <w:t>{{date}}</w:t>
+                            </w:r>
                           </w:p>
                         </w:txbxContent>
                       </v:textbox>

</xml_diff>